<commit_message>
LA MARQUE 7부 2~5화: 기존 인물과 겹치는 이름 정리 (Fabre→Rousset, Morel→Ravel, Lacombe→Marchal)
Co-Authored-By: Claude Opus 5.5 <noreply@anthropic.com>
Claude-Session: https://claude.ai/code/session_01N4vhCLeYxrjvGnDxQBD9Cq
</commit_message>
<xml_diff>
--- a/la-marque/대본/7부/02화_Bpifrance_et_la_Region.docx
+++ b/la-marque/대본/7부/02화_Bpifrance_et_la_Region.docx
@@ -113,7 +113,7 @@
         <w:t xml:space="preserve">”</w:t>
       </w:r>
       <w:r>
-        <w:t xml:space="preserve">(바스티앵이 이메일 서명에서 휴대폰 번호 확보). 지역청 부의장 상드린 파브르(14개월 뒤 선거) vs 담당관 티에리 가야르(시옹지에, 삼촌이 부비에 크롬 도금): 80개 일자리 보도자료 요구, 표준 협약 12조 전액 환수. 지훈의 오송 이웃 공장(300개 약속 → 180개 → 6개월 파견직) 증언. 클레망스 제안: 협약 45개(3년)·목표 70개(5년, 조항 없음)·비례 환수. 파브르 역제안: 보조금 250만 → 200만, 선급금 150만(0%), 15년 지역 유지(+상호성 조항). «Je préfère deux millions et un chiffre vrai à deux millions cinq et un chiffre faux.» 협상 불가 조건: 클뤼즈 기술고등학교(제라르가 선반을 배운 곳) 바이오생산 견습생 2년 차부터 ↔ 클레망스: 부비에 출신 우선 채용. 황무지 기금 6월 위원회(50% = 20만). 남은 공백 830만 → 은행(5화). 정 대표 «Cinq cent mille, c’est le prix d’une phrase vraie.» 결정 72번</w:t>
+        <w:t xml:space="preserve">(바스티앵이 이메일 서명에서 휴대폰 번호 확보). 지역청 부의장 상드린 루세(14개월 뒤 선거) vs 담당관 티에리 가야르(시옹지에, 삼촌이 부비에 크롬 도금): 80개 일자리 보도자료 요구, 표준 협약 12조 전액 환수. 지훈의 오송 이웃 공장(300개 약속 → 180개 → 6개월 파견직) 증언. 클레망스 제안: 협약 45개(3년)·목표 70개(5년, 조항 없음)·비례 환수. 루세 역제안: 보조금 250만 → 200만, 선급금 150만(0%), 15년 지역 유지(+상호성 조항). «Je préfère deux millions et un chiffre vrai à deux millions cinq et un chiffre faux.» 협상 불가 조건: 클뤼즈 기술고등학교(제라르가 선반을 배운 곳) 바이오생산 견습생 2년 차부터 ↔ 클레망스: 부비에 출신 우선 채용. 황무지 기금 6월 위원회(50% = 20만). 남은 공백 830만 → 은행(5화). 정 대표 «Cinq cent mille, c’est le prix d’une phrase vraie.» 결정 72번</w:t>
       </w:r>
       <w:r>
         <w:t xml:space="preserve"> </w:t>
@@ -125,7 +125,7 @@
         <w:t xml:space="preserve"> </w:t>
       </w:r>
       <w:r>
-        <w:t xml:space="preserve">- 등장인물: Clémence, Julien, Bastien, Jihoon, Olivier Masson(Bpifrance — 신규), Sandrine Fabre(지역청 산업 담당 부의장 — 신규), Thierry Gaillard(지역청 담당관 — 신규)</w:t>
+        <w:t xml:space="preserve">- 등장인물: Clémence, Julien, Bastien, Jihoon, Olivier Masson(Bpifrance — 신규), Sandrine Rousset(지역청 산업 담당 부의장 — 신규), Thierry Gaillard(지역청 담당관 — 신규)</w:t>
       </w:r>
       <w:r>
         <w:t xml:space="preserve"> </w:t>
@@ -949,7 +949,7 @@
         <w:pStyle w:val="FirstParagraph"/>
       </w:pPr>
       <w:r>
-        <w:t xml:space="preserve">FABRE: Madame Arnaud, bienvenue à l’Hôtel de Région. Sandrine Fabre, vice-présidente déléguée à l’industrie. Voici Thierry Gaillard, notre chargé de mission.</w:t>
+        <w:t xml:space="preserve">ROUSSET: Madame Arnaud, bienvenue à l’Hôtel de Région. Sandrine Rousset, vice-présidente déléguée à l’industrie. Voici Thierry Gaillard, notre chargé de mission.</w:t>
       </w:r>
     </w:p>
     <w:p>
@@ -981,7 +981,7 @@
         <w:pStyle w:val="BodyText"/>
       </w:pPr>
       <w:r>
-        <w:t xml:space="preserve">FABRE: Thierry, on parlera de la fosse après. Madame Arnaud, votre projet nous plaît beaucoup.</w:t>
+        <w:t xml:space="preserve">ROUSSET: Thierry, on parlera de la fosse après. Madame Arnaud, votre projet nous plaît beaucoup.</w:t>
       </w:r>
     </w:p>
     <w:p>
@@ -997,7 +997,7 @@
         <w:pStyle w:val="BodyText"/>
       </w:pPr>
       <w:r>
-        <w:t xml:space="preserve">FABRE: Quatre millions au total. C’est un gros dossier pour notre commission. Pour le défendre, il me faut un chiffre fort. Une usine de santé, dans une vallée qui a perdu ses décolleteurs, c’est une belle histoire. Mais les élus votent des chiffres. Quarante-cinq emplois, c’est un atelier. Quatre-vingts, c’est une usine.</w:t>
+        <w:t xml:space="preserve">ROUSSET: Quatre millions au total. C’est un gros dossier pour notre commission. Pour le défendre, il me faut un chiffre fort. Une usine de santé, dans une vallée qui a perdu ses décolleteurs, c’est une belle histoire. Mais les élus votent des chiffres. Quarante-cinq emplois, c’est un atelier. Quatre-vingts, c’est une usine.</w:t>
       </w:r>
     </w:p>
     <w:p>
@@ -1013,7 +1013,7 @@
         <w:pStyle w:val="BodyText"/>
       </w:pPr>
       <w:r>
-        <w:t xml:space="preserve">FABRE: Les plans de production changent. Vous ajouterez une troisième ligne dans cinq ans.</w:t>
+        <w:t xml:space="preserve">ROUSSET: Les plans de production changent. Vous ajouterez une troisième ligne dans cinq ans.</w:t>
       </w:r>
     </w:p>
     <w:p>
@@ -1037,7 +1037,7 @@
         <w:pStyle w:val="BodyText"/>
       </w:pPr>
       <w:r>
-        <w:t xml:space="preserve">FABRE: Je connais la clause, Thierry.</w:t>
+        <w:t xml:space="preserve">ROUSSET: Je connais la clause, Thierry.</w:t>
       </w:r>
     </w:p>
     <w:p>
@@ -1077,7 +1077,7 @@
         <w:pStyle w:val="BodyText"/>
       </w:pPr>
       <w:r>
-        <w:t xml:space="preserve">FABRE: Bien sûr. Vous êtes le partenaire coréen ? On m’a posé la question en commission.</w:t>
+        <w:t xml:space="preserve">ROUSSET: Bien sûr. Vous êtes le partenaire coréen ? On m’a posé la question en commission.</w:t>
       </w:r>
     </w:p>
     <w:p>
@@ -1093,7 +1093,7 @@
         <w:pStyle w:val="BodyText"/>
       </w:pPr>
       <w:r>
-        <w:t xml:space="preserve">FABRE: Alors parlez comme un contribuable de Cluses.</w:t>
+        <w:t xml:space="preserve">ROUSSET: Alors parlez comme un contribuable de Cluses.</w:t>
       </w:r>
     </w:p>
     <w:p>
@@ -1109,7 +1109,7 @@
         <w:pStyle w:val="BodyText"/>
       </w:pPr>
       <w:r>
-        <w:t xml:space="preserve">FABRE: Vous suggérez que nous encourageons les mensonges ?</w:t>
+        <w:t xml:space="preserve">ROUSSET: Vous suggérez que nous encourageons les mensonges ?</w:t>
       </w:r>
     </w:p>
     <w:p>
@@ -1133,7 +1133,7 @@
         <w:pStyle w:val="BodyText"/>
       </w:pPr>
       <w:r>
-        <w:t xml:space="preserve">FABRE: Madame Arnaud, je suis élue. Dans quatorze mois, il y a des élections. Je ne vais pas faire semblant : un communiqué avec quatre-vingts emplois m’aide plus qu’un communiqué avec quarante-cinq. Mais je ne veux pas non plus d’intérimaires pendant six mois. Alors, que proposez-vous ?</w:t>
+        <w:t xml:space="preserve">ROUSSET: Madame Arnaud, je suis élue. Dans quatorze mois, il y a des élections. Je ne vais pas faire semblant : un communiqué avec quatre-vingts emplois m’aide plus qu’un communiqué avec quarante-cinq. Mais je ne veux pas non plus d’intérimaires pendant six mois. Alors, que proposez-vous ?</w:t>
       </w:r>
     </w:p>
     <w:p>
@@ -1157,7 +1157,7 @@
         <w:pStyle w:val="BodyText"/>
       </w:pPr>
       <w:r>
-        <w:t xml:space="preserve">FABRE: Pour Annecy, c’était une usine de six cents personnes.</w:t>
+        <w:t xml:space="preserve">ROUSSET: Pour Annecy, c’était une usine de six cents personnes.</w:t>
       </w:r>
     </w:p>
     <w:p>
@@ -1173,7 +1173,7 @@
         <w:pStyle w:val="BodyText"/>
       </w:pPr>
       <w:r>
-        <w:t xml:space="preserve">FABRE: Thierry, vous êtes de quel côté ?</w:t>
+        <w:t xml:space="preserve">ROUSSET: Thierry, vous êtes de quel côté ?</w:t>
       </w:r>
     </w:p>
     <w:p>
@@ -1199,7 +1199,7 @@
         <w:pStyle w:val="FirstParagraph"/>
       </w:pPr>
       <w:r>
-        <w:t xml:space="preserve">FABRE: Bien. Voici ma contre-proposition. Si vous voulez la clause proportionnelle, la commission voudra moins de risque. Subvention réduite à deux millions. L’avance remboursable reste à un million cinq. Et une condition de plus : vous restez dans la région quinze ans, pas dix. Avec quatre-vingts emplois dans la convention, je pouvais défendre deux millions cinq.</w:t>
+        <w:t xml:space="preserve">ROUSSET: Bien. Voici ma contre-proposition. Si vous voulez la clause proportionnelle, la commission voudra moins de risque. Subvention réduite à deux millions. L’avance remboursable reste à un million cinq. Et une condition de plus : vous restez dans la région quinze ans, pas dix. Avec quatre-vingts emplois dans la convention, je pouvais défendre deux millions cinq.</w:t>
       </w:r>
     </w:p>
     <w:p>
@@ -1223,7 +1223,7 @@
         <w:pStyle w:val="BodyText"/>
       </w:pPr>
       <w:r>
-        <w:t xml:space="preserve">FABRE: Vous ne négociez pas beaucoup, madame Arnaud.</w:t>
+        <w:t xml:space="preserve">ROUSSET: Vous ne négociez pas beaucoup, madame Arnaud.</w:t>
       </w:r>
     </w:p>
     <w:p>
@@ -1239,7 +1239,7 @@
         <w:pStyle w:val="BodyText"/>
       </w:pPr>
       <w:r>
-        <w:t xml:space="preserve">FABRE: Quinze ans, c’est la durée de vie d’un bâtiment industriel. Vous construisez pour moins ?</w:t>
+        <w:t xml:space="preserve">ROUSSET: Quinze ans, c’est la durée de vie d’un bâtiment industriel. Vous construisez pour moins ?</w:t>
       </w:r>
     </w:p>
     <w:p>
@@ -1271,7 +1271,7 @@
         <w:pStyle w:val="BodyText"/>
       </w:pPr>
       <w:r>
-        <w:t xml:space="preserve">FABRE: Thierry ajoute beaucoup de choses aujourd’hui.</w:t>
+        <w:t xml:space="preserve">ROUSSET: Thierry ajoute beaucoup de choses aujourd’hui.</w:t>
       </w:r>
     </w:p>
     <w:p>
@@ -1287,7 +1287,7 @@
         <w:pStyle w:val="BodyText"/>
       </w:pPr>
       <w:r>
-        <w:t xml:space="preserve">FABRE: Vous êtes insupportable, Thierry. C’est pour ça que je vous garde.</w:t>
+        <w:t xml:space="preserve">ROUSSET: Vous êtes insupportable, Thierry. C’est pour ça que je vous garde.</w:t>
       </w:r>
     </w:p>
     <w:p>
@@ -1327,7 +1327,7 @@
         <w:pStyle w:val="BodyText"/>
       </w:pPr>
       <w:r>
-        <w:t xml:space="preserve">FABRE: Une dernière condition, et celle-là n’est pas négociable. Une usine de santé dans la vallée, ce sont aussi des métiers nouveaux. Je veux un partenariat avec le lycée technique de Cluses. Des apprentis en bioproduction dès la deuxième année. La vallée a formé des décolleteurs pendant un siècle. Elle doit apprendre autre chose.</w:t>
+        <w:t xml:space="preserve">ROUSSET: Une dernière condition, et celle-là n’est pas négociable. Une usine de santé dans la vallée, ce sont aussi des métiers nouveaux. Je veux un partenariat avec le lycée technique de Cluses. Des apprentis en bioproduction dès la deuxième année. La vallée a formé des décolleteurs pendant un siècle. Elle doit apprendre autre chose.</w:t>
       </w:r>
     </w:p>
     <w:p>
@@ -1343,7 +1343,7 @@
         <w:pStyle w:val="BodyText"/>
       </w:pPr>
       <w:r>
-        <w:t xml:space="preserve">FABRE: Alors il pourra venir parler aux apprentis. Les gamins écoutent mieux les anciens que les élus.</w:t>
+        <w:t xml:space="preserve">ROUSSET: Alors il pourra venir parler aux apprentis. Les gamins écoutent mieux les anciens que les élus.</w:t>
       </w:r>
     </w:p>
     <w:p>
@@ -1367,7 +1367,7 @@
         <w:pStyle w:val="BodyText"/>
       </w:pPr>
       <w:r>
-        <w:t xml:space="preserve">FABRE: Vous m’offrez une phrase pour mon communiqué, sans que je la demande.</w:t>
+        <w:t xml:space="preserve">ROUSSET: Vous m’offrez une phrase pour mon communiqué, sans que je la demande.</w:t>
       </w:r>
     </w:p>
     <w:p>
@@ -1391,7 +1391,7 @@
         <w:pStyle w:val="BodyText"/>
       </w:pPr>
       <w:r>
-        <w:t xml:space="preserve">FABRE: Et soixante-dix dans le communiqué. Comme objectif. C’est vrai, n’est-ce pas ?</w:t>
+        <w:t xml:space="preserve">ROUSSET: Et soixante-dix dans le communiqué. Comme objectif. C’est vrai, n’est-ce pas ?</w:t>
       </w:r>
     </w:p>
     <w:bookmarkEnd w:id="24"/>
@@ -3681,7 +3681,7 @@
         <w:pStyle w:val="FirstParagraph"/>
       </w:pPr>
       <w:r>
-        <w:t xml:space="preserve">파브르: 아르노 대표님, 지역청에 오신 걸 환영해요. 산업 담당 부의장 상드린 파브르입니다. 이쪽은 담당관 티에리 가야르.</w:t>
+        <w:t xml:space="preserve">루세: 아르노 대표님, 지역청에 오신 걸 환영해요. 산업 담당 부의장 상드린 루세입니다. 이쪽은 담당관 티에리 가야르.</w:t>
       </w:r>
     </w:p>
     <w:p>
@@ -3713,7 +3713,7 @@
         <w:pStyle w:val="BodyText"/>
       </w:pPr>
       <w:r>
-        <w:t xml:space="preserve">파브르: 티에리, 구덩이 얘긴 나중에. 아르노 대표님, 프로젝트가 아주 마음에 들어요.</w:t>
+        <w:t xml:space="preserve">루세: 티에리, 구덩이 얘긴 나중에. 아르노 대표님, 프로젝트가 아주 마음에 들어요.</w:t>
       </w:r>
     </w:p>
     <w:p>
@@ -3729,7 +3729,7 @@
         <w:pStyle w:val="BodyText"/>
       </w:pPr>
       <w:r>
-        <w:t xml:space="preserve">파브르: 합쳐서 400만. 위원회엔 큰 안건이에요. 그걸 밀려면 강한 숫자가 필요해요. 정밀가공 공장들을 잃은 계곡에 들어서는 의료 공장, 좋은 이야기죠. 하지만 의원들은 숫자에 투표해요. 일자리 45개는 작업장이에요. 80개라야 공장이죠.</w:t>
+        <w:t xml:space="preserve">루세: 합쳐서 400만. 위원회엔 큰 안건이에요. 그걸 밀려면 강한 숫자가 필요해요. 정밀가공 공장들을 잃은 계곡에 들어서는 의료 공장, 좋은 이야기죠. 하지만 의원들은 숫자에 투표해요. 일자리 45개는 작업장이에요. 80개라야 공장이죠.</w:t>
       </w:r>
     </w:p>
     <w:p>
@@ -3745,7 +3745,7 @@
         <w:pStyle w:val="BodyText"/>
       </w:pPr>
       <w:r>
-        <w:t xml:space="preserve">파브르: 생산 계획은 바뀌어요. 5년 뒤엔 세 번째 라인을 놓으실 거고.</w:t>
+        <w:t xml:space="preserve">루세: 생산 계획은 바뀌어요. 5년 뒤엔 세 번째 라인을 놓으실 거고.</w:t>
       </w:r>
     </w:p>
     <w:p>
@@ -3769,7 +3769,7 @@
         <w:pStyle w:val="BodyText"/>
       </w:pPr>
       <w:r>
-        <w:t xml:space="preserve">파브르: 조항은 알아요, 티에리.</w:t>
+        <w:t xml:space="preserve">루세: 조항은 알아요, 티에리.</w:t>
       </w:r>
     </w:p>
     <w:p>
@@ -3809,7 +3809,7 @@
         <w:pStyle w:val="BodyText"/>
       </w:pPr>
       <w:r>
-        <w:t xml:space="preserve">파브르: 물론이죠. 한국 파트너세요? 위원회에서 그 질문을 받았어요.</w:t>
+        <w:t xml:space="preserve">루세: 물론이죠. 한국 파트너세요? 위원회에서 그 질문을 받았어요.</w:t>
       </w:r>
     </w:p>
     <w:p>
@@ -3825,7 +3825,7 @@
         <w:pStyle w:val="BodyText"/>
       </w:pPr>
       <w:r>
-        <w:t xml:space="preserve">파브르: 그럼 클뤼즈 납세자로서 말씀하세요.</w:t>
+        <w:t xml:space="preserve">루세: 그럼 클뤼즈 납세자로서 말씀하세요.</w:t>
       </w:r>
     </w:p>
     <w:p>
@@ -3841,7 +3841,7 @@
         <w:pStyle w:val="BodyText"/>
       </w:pPr>
       <w:r>
-        <w:t xml:space="preserve">파브르: 우리가 거짓말을 부추긴다는 말씀인가요?</w:t>
+        <w:t xml:space="preserve">루세: 우리가 거짓말을 부추긴다는 말씀인가요?</w:t>
       </w:r>
     </w:p>
     <w:p>
@@ -3865,7 +3865,7 @@
         <w:pStyle w:val="BodyText"/>
       </w:pPr>
       <w:r>
-        <w:t xml:space="preserve">파브르: 아르노 대표님, 저는 선출직이에요. 14개월 뒤 선거가 있어요. 솔직히 말하죠. 일자리 80개짜리 보도자료가 45개짜리보다 저한테 도움이 돼요. 하지만 6개월짜리 파견직도 원하지 않아요. 그럼 뭘 제안하시겠어요?</w:t>
+        <w:t xml:space="preserve">루세: 아르노 대표님, 저는 선출직이에요. 14개월 뒤 선거가 있어요. 솔직히 말하죠. 일자리 80개짜리 보도자료가 45개짜리보다 저한테 도움이 돼요. 하지만 6개월짜리 파견직도 원하지 않아요. 그럼 뭘 제안하시겠어요?</w:t>
       </w:r>
     </w:p>
     <w:p>
@@ -3889,7 +3889,7 @@
         <w:pStyle w:val="BodyText"/>
       </w:pPr>
       <w:r>
-        <w:t xml:space="preserve">파브르: 안시는 600명짜리 공장이었어요.</w:t>
+        <w:t xml:space="preserve">루세: 안시는 600명짜리 공장이었어요.</w:t>
       </w:r>
     </w:p>
     <w:p>
@@ -3905,7 +3905,7 @@
         <w:pStyle w:val="BodyText"/>
       </w:pPr>
       <w:r>
-        <w:t xml:space="preserve">파브르: 티에리, 당신 누구 편이에요?</w:t>
+        <w:t xml:space="preserve">루세: 티에리, 당신 누구 편이에요?</w:t>
       </w:r>
     </w:p>
     <w:p>
@@ -3931,7 +3931,7 @@
         <w:pStyle w:val="FirstParagraph"/>
       </w:pPr>
       <w:r>
-        <w:t xml:space="preserve">파브르: 좋아요. 제 역제안이에요. 비례 조항을 원하시면 위원회는 위험을 줄이려 할 거예요. 보조금은 200만으로 줄여요. 상환형 선급금은 150만 그대로. 그리고 조건 하나 더. 지역에 10년이 아니라 15년 머무르세요. 협약에 80명이 있었다면 250만을 밀 수 있었어요.</w:t>
+        <w:t xml:space="preserve">루세: 좋아요. 제 역제안이에요. 비례 조항을 원하시면 위원회는 위험을 줄이려 할 거예요. 보조금은 200만으로 줄여요. 상환형 선급금은 150만 그대로. 그리고 조건 하나 더. 지역에 10년이 아니라 15년 머무르세요. 협약에 80명이 있었다면 250만을 밀 수 있었어요.</w:t>
       </w:r>
     </w:p>
     <w:p>
@@ -3955,7 +3955,7 @@
         <w:pStyle w:val="BodyText"/>
       </w:pPr>
       <w:r>
-        <w:t xml:space="preserve">파브르: 협상을 별로 안 하시네요, 아르노 대표님.</w:t>
+        <w:t xml:space="preserve">루세: 협상을 별로 안 하시네요, 아르노 대표님.</w:t>
       </w:r>
     </w:p>
     <w:p>
@@ -3971,7 +3971,7 @@
         <w:pStyle w:val="BodyText"/>
       </w:pPr>
       <w:r>
-        <w:t xml:space="preserve">파브르: 15년은 산업 건물의 수명이에요. 그보다 짧게 지으시나요?</w:t>
+        <w:t xml:space="preserve">루세: 15년은 산업 건물의 수명이에요. 그보다 짧게 지으시나요?</w:t>
       </w:r>
     </w:p>
     <w:p>
@@ -4003,7 +4003,7 @@
         <w:pStyle w:val="BodyText"/>
       </w:pPr>
       <w:r>
-        <w:t xml:space="preserve">파브르: 티에리가 오늘 많이 넣네요.</w:t>
+        <w:t xml:space="preserve">루세: 티에리가 오늘 많이 넣네요.</w:t>
       </w:r>
     </w:p>
     <w:p>
@@ -4019,7 +4019,7 @@
         <w:pStyle w:val="BodyText"/>
       </w:pPr>
       <w:r>
-        <w:t xml:space="preserve">파브르: 정말 못 말리겠네요, 티에리. 그래서 붙잡아 두는 거지만.</w:t>
+        <w:t xml:space="preserve">루세: 정말 못 말리겠네요, 티에리. 그래서 붙잡아 두는 거지만.</w:t>
       </w:r>
     </w:p>
     <w:p>
@@ -4059,7 +4059,7 @@
         <w:pStyle w:val="BodyText"/>
       </w:pPr>
       <w:r>
-        <w:t xml:space="preserve">파브르: 마지막 조건, 이건 협상 불가예요. 계곡에 의료 공장이 들어온다는 건 새로운 직업이 생긴다는 거예요. 클뤼즈 기술고등학교와의 협력을 원해요. 2년 차부터 바이오생산 견습생. 이 계곡은 100년 동안 정밀가공 기술자를 길렀어요. 이제 다른 걸 배워야 해요.</w:t>
+        <w:t xml:space="preserve">루세: 마지막 조건, 이건 협상 불가예요. 계곡에 의료 공장이 들어온다는 건 새로운 직업이 생긴다는 거예요. 클뤼즈 기술고등학교와의 협력을 원해요. 2년 차부터 바이오생산 견습생. 이 계곡은 100년 동안 정밀가공 기술자를 길렀어요. 이제 다른 걸 배워야 해요.</w:t>
       </w:r>
     </w:p>
     <w:p>
@@ -4075,7 +4075,7 @@
         <w:pStyle w:val="BodyText"/>
       </w:pPr>
       <w:r>
-        <w:t xml:space="preserve">파브르: 그럼 견습생들한테 이야기해 주러 오시면 되겠네요. 애들은 정치인보다 어르신 말을 잘 들어요.</w:t>
+        <w:t xml:space="preserve">루세: 그럼 견습생들한테 이야기해 주러 오시면 되겠네요. 애들은 정치인보다 어르신 말을 잘 들어요.</w:t>
       </w:r>
     </w:p>
     <w:p>
@@ -4099,7 +4099,7 @@
         <w:pStyle w:val="BodyText"/>
       </w:pPr>
       <w:r>
-        <w:t xml:space="preserve">파브르: 요청하지도 않았는데 보도자료 문장을 주시네요.</w:t>
+        <w:t xml:space="preserve">루세: 요청하지도 않았는데 보도자료 문장을 주시네요.</w:t>
       </w:r>
     </w:p>
     <w:p>
@@ -4123,7 +4123,7 @@
         <w:pStyle w:val="BodyText"/>
       </w:pPr>
       <w:r>
-        <w:t xml:space="preserve">파브르: 그리고 보도자료엔 70. 목표로. 사실이죠, 그렇죠?</w:t>
+        <w:t xml:space="preserve">루세: 그리고 보도자료엔 70. 목표로. 사실이죠, 그렇죠?</w:t>
       </w:r>
     </w:p>
     <w:bookmarkEnd w:id="36"/>

</xml_diff>